<commit_message>
fix(legal-docs): accept tracked changes in FA Schedules 5-9
The generated FA showed vertical bars in the left margin of Schedules 5-9
(e.g. page 51, after Schedule 5 item 7). The template still held 7 unaccepted
Word revisions on blank spacer paragraphs, and LibreOffice draws a change bar
beside each one. Accepts them in the clean copy and retags; wording is
unchanged, one empty paragraph after Schedule 5 item 7 is removed. Adds a
test that fails if any shipped .docx template has tracked changes.

Refs: https://app.notion.com/p/3f26d1eef72a817c90f2cc69face1acd
</commit_message>
<xml_diff>
--- a/apps/api/src/modules/applications/templates/02 FA (Clean Copy) 19 August 2026.docx
+++ b/apps/api/src/modules/applications/templates/02 FA (Clean Copy) 19 August 2026.docx
@@ -15602,14 +15602,6 @@
     </w:p>
     <w:p>
       <w:pPr>
-        <w:pStyle w:val="ListParagraph"/>
-        <w:rPr>
-          <w:del w:id="0" w:author="Juan Johari (ATS)" w:date="2026-08-19T00:00:00Z"/>
-        </w:rPr>
-      </w:pPr>
-    </w:p>
-    <w:p>
-      <w:pPr>
         <w:spacing w:after="0" w:line="276" w:lineRule="auto"/>
         <w:jc w:val="both"/>
       </w:pPr>
@@ -15711,15 +15703,10 @@
       <w:pPr>
         <w:spacing w:after="0" w:line="276" w:lineRule="auto"/>
         <w:jc w:val="both"/>
-        <w:rPr>
-          <w:ins w:id="1" w:author="Juan Johari (ATS)" w:date="2026-08-19T00:00:00Z"/>
-        </w:rPr>
-      </w:pPr>
-      <w:ins w:id="2" w:author="Juan Johari (ATS)" w:date="2026-08-19T00:00:00Z">
-        <w:r>
-          <w:t xml:space="preserve"> </w:t>
-        </w:r>
-      </w:ins>
+      </w:pPr>
+      <w:r>
+        <w:t xml:space="preserve"> </w:t>
+      </w:r>
     </w:p>
     <w:p>
       <w:pPr>
@@ -16104,7 +16091,6 @@
         <w:spacing w:after="0" w:line="276" w:lineRule="auto"/>
         <w:jc w:val="both"/>
         <w:rPr>
-          <w:ins w:id="3" w:author="Juan Johari (ATS)" w:date="2026-08-19T00:00:00Z"/>
           <w:i/>
         </w:rPr>
       </w:pPr>
@@ -16660,9 +16646,6 @@
       <w:pPr>
         <w:spacing w:after="0" w:line="276" w:lineRule="auto"/>
         <w:jc w:val="both"/>
-        <w:rPr>
-          <w:ins w:id="4" w:author="Juan Johari (ATS)" w:date="2026-08-19T00:00:00Z"/>
-        </w:rPr>
       </w:pPr>
     </w:p>
     <w:p>
@@ -17693,9 +17676,6 @@
       <w:pPr>
         <w:spacing w:after="0" w:line="276" w:lineRule="auto"/>
         <w:jc w:val="both"/>
-        <w:rPr>
-          <w:ins w:id="5" w:author="Juan Johari (ATS)" w:date="2026-08-19T00:00:00Z"/>
-        </w:rPr>
       </w:pPr>
     </w:p>
     <w:p>
@@ -18735,9 +18715,6 @@
       <w:pPr>
         <w:spacing w:after="0" w:line="276" w:lineRule="auto"/>
         <w:jc w:val="both"/>
-        <w:rPr>
-          <w:ins w:id="6" w:author="Juan Johari (ATS)" w:date="2026-08-19T00:00:00Z"/>
-        </w:rPr>
       </w:pPr>
     </w:p>
     <w:p>

</xml_diff>